<commit_message>
Displaying multiple different tiles
</commit_message>
<xml_diff>
--- a/Final Major Project.docx
+++ b/Final Major Project.docx
@@ -267,6 +267,13 @@
     </w:p>
     <w:sdt>
       <w:sdtPr>
+        <w:rPr>
+          <w:caps w:val="0"/>
+          <w:color w:val="auto"/>
+          <w:spacing w:val="0"/>
+          <w:sz w:val="20"/>
+          <w:szCs w:val="20"/>
+        </w:rPr>
         <w:id w:val="-816721996"/>
         <w:docPartObj>
           <w:docPartGallery w:val="Table of Contents"/>
@@ -277,12 +284,7 @@
         <w:rPr>
           <w:b/>
           <w:bCs/>
-          <w:caps w:val="0"/>
           <w:noProof/>
-          <w:color w:val="auto"/>
-          <w:spacing w:val="0"/>
-          <w:sz w:val="20"/>
-          <w:szCs w:val="20"/>
         </w:rPr>
       </w:sdtEndPr>
       <w:sdtContent>
@@ -2578,42 +2580,6 @@
           <w:lang w:val="en-US"/>
         </w:rPr>
       </w:pPr>
-    </w:p>
-    <w:p>
-      <w:pPr>
-        <w:rPr>
-          <w:sz w:val="24"/>
-          <w:szCs w:val="24"/>
-          <w:lang w:val="en-US"/>
-        </w:rPr>
-      </w:pPr>
-    </w:p>
-    <w:p>
-      <w:pPr>
-        <w:rPr>
-          <w:sz w:val="24"/>
-          <w:szCs w:val="24"/>
-          <w:lang w:val="en-US"/>
-        </w:rPr>
-      </w:pPr>
-    </w:p>
-    <w:p>
-      <w:pPr>
-        <w:rPr>
-          <w:sz w:val="24"/>
-          <w:szCs w:val="24"/>
-          <w:lang w:val="en-US"/>
-        </w:rPr>
-      </w:pPr>
-    </w:p>
-    <w:p>
-      <w:pPr>
-        <w:rPr>
-          <w:sz w:val="24"/>
-          <w:szCs w:val="24"/>
-          <w:lang w:val="en-US"/>
-        </w:rPr>
-      </w:pPr>
       <w:r>
         <w:rPr>
           <w:noProof/>
@@ -2621,6 +2587,7 @@
           <w:szCs w:val="24"/>
           <w:lang w:val="en-US"/>
         </w:rPr>
+        <w:lastRenderedPageBreak/>
         <w:drawing>
           <wp:anchor distT="0" distB="0" distL="114300" distR="114300" simplePos="0" relativeHeight="251659264" behindDoc="0" locked="0" layoutInCell="1" allowOverlap="1" wp14:anchorId="53BD4873" wp14:editId="54C77E56">
             <wp:simplePos x="0" y="0"/>
@@ -3572,20 +3539,1217 @@
           <w:lang w:val="en-US"/>
         </w:rPr>
       </w:pPr>
-    </w:p>
-    <w:p>
-      <w:pPr>
-        <w:rPr>
-          <w:sz w:val="24"/>
-          <w:szCs w:val="24"/>
-          <w:lang w:val="en-US"/>
-        </w:rPr>
-      </w:pPr>
+      <w:proofErr w:type="spellStart"/>
+      <w:r>
+        <w:rPr>
+          <w:sz w:val="24"/>
+          <w:szCs w:val="24"/>
+          <w:lang w:val="en-US"/>
+        </w:rPr>
+        <w:t>Uml</w:t>
+      </w:r>
+      <w:proofErr w:type="spellEnd"/>
+    </w:p>
+    <w:p>
+      <w:pPr>
+        <w:rPr>
+          <w:sz w:val="24"/>
+          <w:szCs w:val="24"/>
+          <w:lang w:val="en-US"/>
+        </w:rPr>
+      </w:pPr>
+      <w:r>
+        <w:rPr>
+          <w:sz w:val="24"/>
+          <w:szCs w:val="24"/>
+          <w:lang w:val="en-US"/>
+        </w:rPr>
+        <w:t>Flowchart</w:t>
+      </w:r>
+    </w:p>
+    <w:p>
+      <w:pPr>
+        <w:rPr>
+          <w:sz w:val="24"/>
+          <w:szCs w:val="24"/>
+          <w:lang w:val="en-US"/>
+        </w:rPr>
+      </w:pPr>
+      <w:proofErr w:type="spellStart"/>
+      <w:r>
+        <w:rPr>
+          <w:sz w:val="24"/>
+          <w:szCs w:val="24"/>
+          <w:lang w:val="en-US"/>
+        </w:rPr>
+        <w:t>PseudoCode</w:t>
+      </w:r>
+      <w:proofErr w:type="spellEnd"/>
+    </w:p>
+    <w:p>
+      <w:pPr>
+        <w:rPr>
+          <w:sz w:val="24"/>
+          <w:szCs w:val="24"/>
+          <w:lang w:val="en-US"/>
+        </w:rPr>
+      </w:pPr>
+    </w:p>
+    <w:p>
+      <w:pPr>
+        <w:rPr>
+          <w:caps/>
+          <w:color w:val="FFFFFF" w:themeColor="background1"/>
+          <w:spacing w:val="15"/>
+          <w:sz w:val="22"/>
+          <w:szCs w:val="22"/>
+          <w:lang w:val="en-US"/>
+        </w:rPr>
+      </w:pPr>
+      <w:r>
+        <w:rPr>
+          <w:lang w:val="en-US"/>
+        </w:rPr>
+        <w:br w:type="page"/>
+      </w:r>
     </w:p>
     <w:p>
       <w:pPr>
         <w:pStyle w:val="Heading1"/>
         <w:rPr>
+          <w:lang w:val="en-US"/>
+        </w:rPr>
+      </w:pPr>
+      <w:r>
+        <w:rPr>
+          <w:lang w:val="en-US"/>
+        </w:rPr>
+        <w:lastRenderedPageBreak/>
+        <w:t>Testing</w:t>
+      </w:r>
+    </w:p>
+    <w:tbl>
+      <w:tblPr>
+        <w:tblStyle w:val="TableGrid"/>
+        <w:tblW w:w="0" w:type="auto"/>
+        <w:tblLook w:val="04A0" w:firstRow="1" w:lastRow="0" w:firstColumn="1" w:lastColumn="0" w:noHBand="0" w:noVBand="1"/>
+      </w:tblPr>
+      <w:tblGrid>
+        <w:gridCol w:w="704"/>
+        <w:gridCol w:w="2300"/>
+        <w:gridCol w:w="1503"/>
+        <w:gridCol w:w="1503"/>
+        <w:gridCol w:w="1503"/>
+        <w:gridCol w:w="1503"/>
+      </w:tblGrid>
+      <w:tr>
+        <w:tc>
+          <w:tcPr>
+            <w:tcW w:w="704" w:type="dxa"/>
+          </w:tcPr>
+          <w:p>
+            <w:pPr>
+              <w:rPr>
+                <w:sz w:val="24"/>
+                <w:szCs w:val="24"/>
+                <w:lang w:val="en-US"/>
+              </w:rPr>
+            </w:pPr>
+            <w:r>
+              <w:rPr>
+                <w:sz w:val="24"/>
+                <w:szCs w:val="24"/>
+                <w:lang w:val="en-US"/>
+              </w:rPr>
+              <w:t>Test ID</w:t>
+            </w:r>
+          </w:p>
+        </w:tc>
+        <w:tc>
+          <w:tcPr>
+            <w:tcW w:w="2300" w:type="dxa"/>
+          </w:tcPr>
+          <w:p>
+            <w:pPr>
+              <w:rPr>
+                <w:sz w:val="24"/>
+                <w:szCs w:val="24"/>
+                <w:lang w:val="en-US"/>
+              </w:rPr>
+            </w:pPr>
+            <w:r>
+              <w:rPr>
+                <w:sz w:val="24"/>
+                <w:szCs w:val="24"/>
+                <w:lang w:val="en-US"/>
+              </w:rPr>
+              <w:t xml:space="preserve">Test </w:t>
+            </w:r>
+          </w:p>
+        </w:tc>
+        <w:tc>
+          <w:tcPr>
+            <w:tcW w:w="1503" w:type="dxa"/>
+          </w:tcPr>
+          <w:p>
+            <w:pPr>
+              <w:rPr>
+                <w:sz w:val="24"/>
+                <w:szCs w:val="24"/>
+                <w:lang w:val="en-US"/>
+              </w:rPr>
+            </w:pPr>
+            <w:r>
+              <w:rPr>
+                <w:sz w:val="24"/>
+                <w:szCs w:val="24"/>
+                <w:lang w:val="en-US"/>
+              </w:rPr>
+              <w:t>Expected Result</w:t>
+            </w:r>
+          </w:p>
+        </w:tc>
+        <w:tc>
+          <w:tcPr>
+            <w:tcW w:w="1503" w:type="dxa"/>
+          </w:tcPr>
+          <w:p>
+            <w:pPr>
+              <w:rPr>
+                <w:sz w:val="24"/>
+                <w:szCs w:val="24"/>
+                <w:lang w:val="en-US"/>
+              </w:rPr>
+            </w:pPr>
+            <w:r>
+              <w:rPr>
+                <w:sz w:val="24"/>
+                <w:szCs w:val="24"/>
+                <w:lang w:val="en-US"/>
+              </w:rPr>
+              <w:t>Actual Result</w:t>
+            </w:r>
+          </w:p>
+        </w:tc>
+        <w:tc>
+          <w:tcPr>
+            <w:tcW w:w="1503" w:type="dxa"/>
+          </w:tcPr>
+          <w:p>
+            <w:pPr>
+              <w:rPr>
+                <w:sz w:val="24"/>
+                <w:szCs w:val="24"/>
+                <w:lang w:val="en-US"/>
+              </w:rPr>
+            </w:pPr>
+            <w:r>
+              <w:rPr>
+                <w:sz w:val="24"/>
+                <w:szCs w:val="24"/>
+                <w:lang w:val="en-US"/>
+              </w:rPr>
+              <w:t>Pass/Fail</w:t>
+            </w:r>
+          </w:p>
+        </w:tc>
+        <w:tc>
+          <w:tcPr>
+            <w:tcW w:w="1503" w:type="dxa"/>
+          </w:tcPr>
+          <w:p>
+            <w:pPr>
+              <w:rPr>
+                <w:sz w:val="24"/>
+                <w:szCs w:val="24"/>
+                <w:lang w:val="en-US"/>
+              </w:rPr>
+            </w:pPr>
+            <w:r>
+              <w:rPr>
+                <w:sz w:val="24"/>
+                <w:szCs w:val="24"/>
+                <w:lang w:val="en-US"/>
+              </w:rPr>
+              <w:t>Changes</w:t>
+            </w:r>
+          </w:p>
+        </w:tc>
+      </w:tr>
+      <w:tr>
+        <w:tc>
+          <w:tcPr>
+            <w:tcW w:w="704" w:type="dxa"/>
+          </w:tcPr>
+          <w:p>
+            <w:pPr>
+              <w:rPr>
+                <w:sz w:val="24"/>
+                <w:szCs w:val="24"/>
+                <w:lang w:val="en-US"/>
+              </w:rPr>
+            </w:pPr>
+            <w:r>
+              <w:rPr>
+                <w:sz w:val="24"/>
+                <w:szCs w:val="24"/>
+                <w:lang w:val="en-US"/>
+              </w:rPr>
+              <w:t>01</w:t>
+            </w:r>
+          </w:p>
+        </w:tc>
+        <w:tc>
+          <w:tcPr>
+            <w:tcW w:w="2300" w:type="dxa"/>
+          </w:tcPr>
+          <w:p>
+            <w:pPr>
+              <w:jc w:val="center"/>
+              <w:rPr>
+                <w:sz w:val="24"/>
+                <w:szCs w:val="24"/>
+                <w:lang w:val="en-US"/>
+              </w:rPr>
+            </w:pPr>
+            <w:r>
+              <w:rPr>
+                <w:sz w:val="24"/>
+                <w:szCs w:val="24"/>
+                <w:lang w:val="en-US"/>
+              </w:rPr>
+              <w:t>Display tiles from array</w:t>
+            </w:r>
+          </w:p>
+        </w:tc>
+        <w:tc>
+          <w:tcPr>
+            <w:tcW w:w="1503" w:type="dxa"/>
+          </w:tcPr>
+          <w:p>
+            <w:pPr>
+              <w:rPr>
+                <w:sz w:val="24"/>
+                <w:szCs w:val="24"/>
+                <w:lang w:val="en-US"/>
+              </w:rPr>
+            </w:pPr>
+          </w:p>
+        </w:tc>
+        <w:tc>
+          <w:tcPr>
+            <w:tcW w:w="1503" w:type="dxa"/>
+          </w:tcPr>
+          <w:p>
+            <w:pPr>
+              <w:rPr>
+                <w:sz w:val="24"/>
+                <w:szCs w:val="24"/>
+                <w:lang w:val="en-US"/>
+              </w:rPr>
+            </w:pPr>
+          </w:p>
+        </w:tc>
+        <w:tc>
+          <w:tcPr>
+            <w:tcW w:w="1503" w:type="dxa"/>
+          </w:tcPr>
+          <w:p>
+            <w:pPr>
+              <w:rPr>
+                <w:sz w:val="24"/>
+                <w:szCs w:val="24"/>
+                <w:lang w:val="en-US"/>
+              </w:rPr>
+            </w:pPr>
+          </w:p>
+        </w:tc>
+        <w:tc>
+          <w:tcPr>
+            <w:tcW w:w="1503" w:type="dxa"/>
+          </w:tcPr>
+          <w:p>
+            <w:pPr>
+              <w:jc w:val="center"/>
+              <w:rPr>
+                <w:sz w:val="24"/>
+                <w:szCs w:val="24"/>
+                <w:lang w:val="en-US"/>
+              </w:rPr>
+            </w:pPr>
+          </w:p>
+        </w:tc>
+      </w:tr>
+      <w:tr>
+        <w:tc>
+          <w:tcPr>
+            <w:tcW w:w="704" w:type="dxa"/>
+          </w:tcPr>
+          <w:p>
+            <w:pPr>
+              <w:rPr>
+                <w:sz w:val="24"/>
+                <w:szCs w:val="24"/>
+                <w:lang w:val="en-US"/>
+              </w:rPr>
+            </w:pPr>
+            <w:r>
+              <w:rPr>
+                <w:sz w:val="24"/>
+                <w:szCs w:val="24"/>
+                <w:lang w:val="en-US"/>
+              </w:rPr>
+              <w:t>02</w:t>
+            </w:r>
+          </w:p>
+        </w:tc>
+        <w:tc>
+          <w:tcPr>
+            <w:tcW w:w="2300" w:type="dxa"/>
+          </w:tcPr>
+          <w:p>
+            <w:pPr>
+              <w:rPr>
+                <w:sz w:val="24"/>
+                <w:szCs w:val="24"/>
+                <w:lang w:val="en-US"/>
+              </w:rPr>
+            </w:pPr>
+            <w:r>
+              <w:rPr>
+                <w:sz w:val="24"/>
+                <w:szCs w:val="24"/>
+                <w:lang w:val="en-US"/>
+              </w:rPr>
+              <w:t>Display multiple different tiles</w:t>
+            </w:r>
+          </w:p>
+        </w:tc>
+        <w:tc>
+          <w:tcPr>
+            <w:tcW w:w="1503" w:type="dxa"/>
+          </w:tcPr>
+          <w:p>
+            <w:pPr>
+              <w:rPr>
+                <w:sz w:val="24"/>
+                <w:szCs w:val="24"/>
+                <w:lang w:val="en-US"/>
+              </w:rPr>
+            </w:pPr>
+          </w:p>
+        </w:tc>
+        <w:tc>
+          <w:tcPr>
+            <w:tcW w:w="1503" w:type="dxa"/>
+          </w:tcPr>
+          <w:p>
+            <w:pPr>
+              <w:rPr>
+                <w:sz w:val="24"/>
+                <w:szCs w:val="24"/>
+                <w:lang w:val="en-US"/>
+              </w:rPr>
+            </w:pPr>
+          </w:p>
+        </w:tc>
+        <w:tc>
+          <w:tcPr>
+            <w:tcW w:w="1503" w:type="dxa"/>
+          </w:tcPr>
+          <w:p>
+            <w:pPr>
+              <w:rPr>
+                <w:sz w:val="24"/>
+                <w:szCs w:val="24"/>
+                <w:lang w:val="en-US"/>
+              </w:rPr>
+            </w:pPr>
+          </w:p>
+        </w:tc>
+        <w:tc>
+          <w:tcPr>
+            <w:tcW w:w="1503" w:type="dxa"/>
+          </w:tcPr>
+          <w:p>
+            <w:pPr>
+              <w:rPr>
+                <w:sz w:val="24"/>
+                <w:szCs w:val="24"/>
+                <w:lang w:val="en-US"/>
+              </w:rPr>
+            </w:pPr>
+          </w:p>
+        </w:tc>
+      </w:tr>
+      <w:tr>
+        <w:tc>
+          <w:tcPr>
+            <w:tcW w:w="704" w:type="dxa"/>
+          </w:tcPr>
+          <w:p>
+            <w:pPr>
+              <w:rPr>
+                <w:sz w:val="24"/>
+                <w:szCs w:val="24"/>
+                <w:lang w:val="en-US"/>
+              </w:rPr>
+            </w:pPr>
+            <w:r>
+              <w:rPr>
+                <w:sz w:val="24"/>
+                <w:szCs w:val="24"/>
+                <w:lang w:val="en-US"/>
+              </w:rPr>
+              <w:t>03</w:t>
+            </w:r>
+          </w:p>
+        </w:tc>
+        <w:tc>
+          <w:tcPr>
+            <w:tcW w:w="2300" w:type="dxa"/>
+          </w:tcPr>
+          <w:p>
+            <w:pPr>
+              <w:rPr>
+                <w:sz w:val="24"/>
+                <w:szCs w:val="24"/>
+                <w:lang w:val="en-US"/>
+              </w:rPr>
+            </w:pPr>
+          </w:p>
+        </w:tc>
+        <w:tc>
+          <w:tcPr>
+            <w:tcW w:w="1503" w:type="dxa"/>
+          </w:tcPr>
+          <w:p>
+            <w:pPr>
+              <w:rPr>
+                <w:sz w:val="24"/>
+                <w:szCs w:val="24"/>
+                <w:lang w:val="en-US"/>
+              </w:rPr>
+            </w:pPr>
+          </w:p>
+        </w:tc>
+        <w:tc>
+          <w:tcPr>
+            <w:tcW w:w="1503" w:type="dxa"/>
+          </w:tcPr>
+          <w:p>
+            <w:pPr>
+              <w:rPr>
+                <w:sz w:val="24"/>
+                <w:szCs w:val="24"/>
+                <w:lang w:val="en-US"/>
+              </w:rPr>
+            </w:pPr>
+          </w:p>
+        </w:tc>
+        <w:tc>
+          <w:tcPr>
+            <w:tcW w:w="1503" w:type="dxa"/>
+          </w:tcPr>
+          <w:p>
+            <w:pPr>
+              <w:rPr>
+                <w:sz w:val="24"/>
+                <w:szCs w:val="24"/>
+                <w:lang w:val="en-US"/>
+              </w:rPr>
+            </w:pPr>
+          </w:p>
+        </w:tc>
+        <w:tc>
+          <w:tcPr>
+            <w:tcW w:w="1503" w:type="dxa"/>
+          </w:tcPr>
+          <w:p>
+            <w:pPr>
+              <w:rPr>
+                <w:sz w:val="24"/>
+                <w:szCs w:val="24"/>
+                <w:lang w:val="en-US"/>
+              </w:rPr>
+            </w:pPr>
+          </w:p>
+        </w:tc>
+      </w:tr>
+      <w:tr>
+        <w:tc>
+          <w:tcPr>
+            <w:tcW w:w="704" w:type="dxa"/>
+          </w:tcPr>
+          <w:p>
+            <w:pPr>
+              <w:rPr>
+                <w:sz w:val="24"/>
+                <w:szCs w:val="24"/>
+                <w:lang w:val="en-US"/>
+              </w:rPr>
+            </w:pPr>
+            <w:r>
+              <w:rPr>
+                <w:sz w:val="24"/>
+                <w:szCs w:val="24"/>
+                <w:lang w:val="en-US"/>
+              </w:rPr>
+              <w:t>04</w:t>
+            </w:r>
+          </w:p>
+        </w:tc>
+        <w:tc>
+          <w:tcPr>
+            <w:tcW w:w="2300" w:type="dxa"/>
+          </w:tcPr>
+          <w:p>
+            <w:pPr>
+              <w:rPr>
+                <w:sz w:val="24"/>
+                <w:szCs w:val="24"/>
+                <w:lang w:val="en-US"/>
+              </w:rPr>
+            </w:pPr>
+          </w:p>
+        </w:tc>
+        <w:tc>
+          <w:tcPr>
+            <w:tcW w:w="1503" w:type="dxa"/>
+          </w:tcPr>
+          <w:p>
+            <w:pPr>
+              <w:rPr>
+                <w:sz w:val="24"/>
+                <w:szCs w:val="24"/>
+                <w:lang w:val="en-US"/>
+              </w:rPr>
+            </w:pPr>
+          </w:p>
+        </w:tc>
+        <w:tc>
+          <w:tcPr>
+            <w:tcW w:w="1503" w:type="dxa"/>
+          </w:tcPr>
+          <w:p>
+            <w:pPr>
+              <w:rPr>
+                <w:sz w:val="24"/>
+                <w:szCs w:val="24"/>
+                <w:lang w:val="en-US"/>
+              </w:rPr>
+            </w:pPr>
+          </w:p>
+        </w:tc>
+        <w:tc>
+          <w:tcPr>
+            <w:tcW w:w="1503" w:type="dxa"/>
+          </w:tcPr>
+          <w:p>
+            <w:pPr>
+              <w:rPr>
+                <w:sz w:val="24"/>
+                <w:szCs w:val="24"/>
+                <w:lang w:val="en-US"/>
+              </w:rPr>
+            </w:pPr>
+          </w:p>
+        </w:tc>
+        <w:tc>
+          <w:tcPr>
+            <w:tcW w:w="1503" w:type="dxa"/>
+          </w:tcPr>
+          <w:p>
+            <w:pPr>
+              <w:rPr>
+                <w:sz w:val="24"/>
+                <w:szCs w:val="24"/>
+                <w:lang w:val="en-US"/>
+              </w:rPr>
+            </w:pPr>
+          </w:p>
+        </w:tc>
+      </w:tr>
+      <w:tr>
+        <w:tc>
+          <w:tcPr>
+            <w:tcW w:w="704" w:type="dxa"/>
+          </w:tcPr>
+          <w:p>
+            <w:pPr>
+              <w:rPr>
+                <w:sz w:val="24"/>
+                <w:szCs w:val="24"/>
+                <w:lang w:val="en-US"/>
+              </w:rPr>
+            </w:pPr>
+            <w:r>
+              <w:rPr>
+                <w:sz w:val="24"/>
+                <w:szCs w:val="24"/>
+                <w:lang w:val="en-US"/>
+              </w:rPr>
+              <w:t>05</w:t>
+            </w:r>
+          </w:p>
+        </w:tc>
+        <w:tc>
+          <w:tcPr>
+            <w:tcW w:w="2300" w:type="dxa"/>
+          </w:tcPr>
+          <w:p>
+            <w:pPr>
+              <w:rPr>
+                <w:sz w:val="24"/>
+                <w:szCs w:val="24"/>
+                <w:lang w:val="en-US"/>
+              </w:rPr>
+            </w:pPr>
+          </w:p>
+        </w:tc>
+        <w:tc>
+          <w:tcPr>
+            <w:tcW w:w="1503" w:type="dxa"/>
+          </w:tcPr>
+          <w:p>
+            <w:pPr>
+              <w:rPr>
+                <w:sz w:val="24"/>
+                <w:szCs w:val="24"/>
+                <w:lang w:val="en-US"/>
+              </w:rPr>
+            </w:pPr>
+          </w:p>
+        </w:tc>
+        <w:tc>
+          <w:tcPr>
+            <w:tcW w:w="1503" w:type="dxa"/>
+          </w:tcPr>
+          <w:p>
+            <w:pPr>
+              <w:rPr>
+                <w:sz w:val="24"/>
+                <w:szCs w:val="24"/>
+                <w:lang w:val="en-US"/>
+              </w:rPr>
+            </w:pPr>
+          </w:p>
+        </w:tc>
+        <w:tc>
+          <w:tcPr>
+            <w:tcW w:w="1503" w:type="dxa"/>
+          </w:tcPr>
+          <w:p>
+            <w:pPr>
+              <w:rPr>
+                <w:sz w:val="24"/>
+                <w:szCs w:val="24"/>
+                <w:lang w:val="en-US"/>
+              </w:rPr>
+            </w:pPr>
+          </w:p>
+        </w:tc>
+        <w:tc>
+          <w:tcPr>
+            <w:tcW w:w="1503" w:type="dxa"/>
+          </w:tcPr>
+          <w:p>
+            <w:pPr>
+              <w:rPr>
+                <w:sz w:val="24"/>
+                <w:szCs w:val="24"/>
+                <w:lang w:val="en-US"/>
+              </w:rPr>
+            </w:pPr>
+          </w:p>
+        </w:tc>
+      </w:tr>
+      <w:tr>
+        <w:tc>
+          <w:tcPr>
+            <w:tcW w:w="704" w:type="dxa"/>
+          </w:tcPr>
+          <w:p>
+            <w:pPr>
+              <w:rPr>
+                <w:sz w:val="24"/>
+                <w:szCs w:val="24"/>
+                <w:lang w:val="en-US"/>
+              </w:rPr>
+            </w:pPr>
+            <w:r>
+              <w:rPr>
+                <w:sz w:val="24"/>
+                <w:szCs w:val="24"/>
+                <w:lang w:val="en-US"/>
+              </w:rPr>
+              <w:t>06</w:t>
+            </w:r>
+          </w:p>
+        </w:tc>
+        <w:tc>
+          <w:tcPr>
+            <w:tcW w:w="2300" w:type="dxa"/>
+          </w:tcPr>
+          <w:p>
+            <w:pPr>
+              <w:rPr>
+                <w:sz w:val="24"/>
+                <w:szCs w:val="24"/>
+                <w:lang w:val="en-US"/>
+              </w:rPr>
+            </w:pPr>
+          </w:p>
+        </w:tc>
+        <w:tc>
+          <w:tcPr>
+            <w:tcW w:w="1503" w:type="dxa"/>
+          </w:tcPr>
+          <w:p>
+            <w:pPr>
+              <w:rPr>
+                <w:sz w:val="24"/>
+                <w:szCs w:val="24"/>
+                <w:lang w:val="en-US"/>
+              </w:rPr>
+            </w:pPr>
+          </w:p>
+        </w:tc>
+        <w:tc>
+          <w:tcPr>
+            <w:tcW w:w="1503" w:type="dxa"/>
+          </w:tcPr>
+          <w:p>
+            <w:pPr>
+              <w:rPr>
+                <w:sz w:val="24"/>
+                <w:szCs w:val="24"/>
+                <w:lang w:val="en-US"/>
+              </w:rPr>
+            </w:pPr>
+          </w:p>
+        </w:tc>
+        <w:tc>
+          <w:tcPr>
+            <w:tcW w:w="1503" w:type="dxa"/>
+          </w:tcPr>
+          <w:p>
+            <w:pPr>
+              <w:rPr>
+                <w:sz w:val="24"/>
+                <w:szCs w:val="24"/>
+                <w:lang w:val="en-US"/>
+              </w:rPr>
+            </w:pPr>
+          </w:p>
+        </w:tc>
+        <w:tc>
+          <w:tcPr>
+            <w:tcW w:w="1503" w:type="dxa"/>
+          </w:tcPr>
+          <w:p>
+            <w:pPr>
+              <w:rPr>
+                <w:sz w:val="24"/>
+                <w:szCs w:val="24"/>
+                <w:lang w:val="en-US"/>
+              </w:rPr>
+            </w:pPr>
+          </w:p>
+        </w:tc>
+      </w:tr>
+      <w:tr>
+        <w:tc>
+          <w:tcPr>
+            <w:tcW w:w="704" w:type="dxa"/>
+          </w:tcPr>
+          <w:p>
+            <w:pPr>
+              <w:rPr>
+                <w:sz w:val="24"/>
+                <w:szCs w:val="24"/>
+                <w:lang w:val="en-US"/>
+              </w:rPr>
+            </w:pPr>
+            <w:r>
+              <w:rPr>
+                <w:sz w:val="24"/>
+                <w:szCs w:val="24"/>
+                <w:lang w:val="en-US"/>
+              </w:rPr>
+              <w:t>07</w:t>
+            </w:r>
+          </w:p>
+        </w:tc>
+        <w:tc>
+          <w:tcPr>
+            <w:tcW w:w="2300" w:type="dxa"/>
+          </w:tcPr>
+          <w:p>
+            <w:pPr>
+              <w:rPr>
+                <w:sz w:val="24"/>
+                <w:szCs w:val="24"/>
+                <w:lang w:val="en-US"/>
+              </w:rPr>
+            </w:pPr>
+          </w:p>
+        </w:tc>
+        <w:tc>
+          <w:tcPr>
+            <w:tcW w:w="1503" w:type="dxa"/>
+          </w:tcPr>
+          <w:p>
+            <w:pPr>
+              <w:rPr>
+                <w:sz w:val="24"/>
+                <w:szCs w:val="24"/>
+                <w:lang w:val="en-US"/>
+              </w:rPr>
+            </w:pPr>
+          </w:p>
+        </w:tc>
+        <w:tc>
+          <w:tcPr>
+            <w:tcW w:w="1503" w:type="dxa"/>
+          </w:tcPr>
+          <w:p>
+            <w:pPr>
+              <w:rPr>
+                <w:sz w:val="24"/>
+                <w:szCs w:val="24"/>
+                <w:lang w:val="en-US"/>
+              </w:rPr>
+            </w:pPr>
+          </w:p>
+        </w:tc>
+        <w:tc>
+          <w:tcPr>
+            <w:tcW w:w="1503" w:type="dxa"/>
+          </w:tcPr>
+          <w:p>
+            <w:pPr>
+              <w:rPr>
+                <w:sz w:val="24"/>
+                <w:szCs w:val="24"/>
+                <w:lang w:val="en-US"/>
+              </w:rPr>
+            </w:pPr>
+          </w:p>
+        </w:tc>
+        <w:tc>
+          <w:tcPr>
+            <w:tcW w:w="1503" w:type="dxa"/>
+          </w:tcPr>
+          <w:p>
+            <w:pPr>
+              <w:rPr>
+                <w:sz w:val="24"/>
+                <w:szCs w:val="24"/>
+                <w:lang w:val="en-US"/>
+              </w:rPr>
+            </w:pPr>
+          </w:p>
+        </w:tc>
+      </w:tr>
+      <w:tr>
+        <w:tc>
+          <w:tcPr>
+            <w:tcW w:w="704" w:type="dxa"/>
+          </w:tcPr>
+          <w:p>
+            <w:pPr>
+              <w:rPr>
+                <w:sz w:val="24"/>
+                <w:szCs w:val="24"/>
+                <w:lang w:val="en-US"/>
+              </w:rPr>
+            </w:pPr>
+            <w:r>
+              <w:rPr>
+                <w:sz w:val="24"/>
+                <w:szCs w:val="24"/>
+                <w:lang w:val="en-US"/>
+              </w:rPr>
+              <w:t>08</w:t>
+            </w:r>
+          </w:p>
+        </w:tc>
+        <w:tc>
+          <w:tcPr>
+            <w:tcW w:w="2300" w:type="dxa"/>
+          </w:tcPr>
+          <w:p>
+            <w:pPr>
+              <w:rPr>
+                <w:sz w:val="24"/>
+                <w:szCs w:val="24"/>
+                <w:lang w:val="en-US"/>
+              </w:rPr>
+            </w:pPr>
+          </w:p>
+        </w:tc>
+        <w:tc>
+          <w:tcPr>
+            <w:tcW w:w="1503" w:type="dxa"/>
+          </w:tcPr>
+          <w:p>
+            <w:pPr>
+              <w:rPr>
+                <w:sz w:val="24"/>
+                <w:szCs w:val="24"/>
+                <w:lang w:val="en-US"/>
+              </w:rPr>
+            </w:pPr>
+          </w:p>
+        </w:tc>
+        <w:tc>
+          <w:tcPr>
+            <w:tcW w:w="1503" w:type="dxa"/>
+          </w:tcPr>
+          <w:p>
+            <w:pPr>
+              <w:rPr>
+                <w:sz w:val="24"/>
+                <w:szCs w:val="24"/>
+                <w:lang w:val="en-US"/>
+              </w:rPr>
+            </w:pPr>
+          </w:p>
+        </w:tc>
+        <w:tc>
+          <w:tcPr>
+            <w:tcW w:w="1503" w:type="dxa"/>
+          </w:tcPr>
+          <w:p>
+            <w:pPr>
+              <w:rPr>
+                <w:sz w:val="24"/>
+                <w:szCs w:val="24"/>
+                <w:lang w:val="en-US"/>
+              </w:rPr>
+            </w:pPr>
+          </w:p>
+        </w:tc>
+        <w:tc>
+          <w:tcPr>
+            <w:tcW w:w="1503" w:type="dxa"/>
+          </w:tcPr>
+          <w:p>
+            <w:pPr>
+              <w:rPr>
+                <w:sz w:val="24"/>
+                <w:szCs w:val="24"/>
+                <w:lang w:val="en-US"/>
+              </w:rPr>
+            </w:pPr>
+          </w:p>
+        </w:tc>
+      </w:tr>
+      <w:tr>
+        <w:tc>
+          <w:tcPr>
+            <w:tcW w:w="704" w:type="dxa"/>
+          </w:tcPr>
+          <w:p>
+            <w:pPr>
+              <w:rPr>
+                <w:sz w:val="24"/>
+                <w:szCs w:val="24"/>
+                <w:lang w:val="en-US"/>
+              </w:rPr>
+            </w:pPr>
+            <w:r>
+              <w:rPr>
+                <w:sz w:val="24"/>
+                <w:szCs w:val="24"/>
+                <w:lang w:val="en-US"/>
+              </w:rPr>
+              <w:t>09</w:t>
+            </w:r>
+          </w:p>
+        </w:tc>
+        <w:tc>
+          <w:tcPr>
+            <w:tcW w:w="2300" w:type="dxa"/>
+          </w:tcPr>
+          <w:p>
+            <w:pPr>
+              <w:rPr>
+                <w:sz w:val="24"/>
+                <w:szCs w:val="24"/>
+                <w:lang w:val="en-US"/>
+              </w:rPr>
+            </w:pPr>
+          </w:p>
+        </w:tc>
+        <w:tc>
+          <w:tcPr>
+            <w:tcW w:w="1503" w:type="dxa"/>
+          </w:tcPr>
+          <w:p>
+            <w:pPr>
+              <w:rPr>
+                <w:sz w:val="24"/>
+                <w:szCs w:val="24"/>
+                <w:lang w:val="en-US"/>
+              </w:rPr>
+            </w:pPr>
+          </w:p>
+        </w:tc>
+        <w:tc>
+          <w:tcPr>
+            <w:tcW w:w="1503" w:type="dxa"/>
+          </w:tcPr>
+          <w:p>
+            <w:pPr>
+              <w:rPr>
+                <w:sz w:val="24"/>
+                <w:szCs w:val="24"/>
+                <w:lang w:val="en-US"/>
+              </w:rPr>
+            </w:pPr>
+          </w:p>
+        </w:tc>
+        <w:tc>
+          <w:tcPr>
+            <w:tcW w:w="1503" w:type="dxa"/>
+          </w:tcPr>
+          <w:p>
+            <w:pPr>
+              <w:rPr>
+                <w:sz w:val="24"/>
+                <w:szCs w:val="24"/>
+                <w:lang w:val="en-US"/>
+              </w:rPr>
+            </w:pPr>
+          </w:p>
+        </w:tc>
+        <w:tc>
+          <w:tcPr>
+            <w:tcW w:w="1503" w:type="dxa"/>
+          </w:tcPr>
+          <w:p>
+            <w:pPr>
+              <w:rPr>
+                <w:sz w:val="24"/>
+                <w:szCs w:val="24"/>
+                <w:lang w:val="en-US"/>
+              </w:rPr>
+            </w:pPr>
+          </w:p>
+        </w:tc>
+      </w:tr>
+      <w:tr>
+        <w:tc>
+          <w:tcPr>
+            <w:tcW w:w="704" w:type="dxa"/>
+          </w:tcPr>
+          <w:p>
+            <w:pPr>
+              <w:rPr>
+                <w:sz w:val="24"/>
+                <w:szCs w:val="24"/>
+                <w:lang w:val="en-US"/>
+              </w:rPr>
+            </w:pPr>
+            <w:r>
+              <w:rPr>
+                <w:sz w:val="24"/>
+                <w:szCs w:val="24"/>
+                <w:lang w:val="en-US"/>
+              </w:rPr>
+              <w:t>10</w:t>
+            </w:r>
+          </w:p>
+        </w:tc>
+        <w:tc>
+          <w:tcPr>
+            <w:tcW w:w="2300" w:type="dxa"/>
+          </w:tcPr>
+          <w:p>
+            <w:pPr>
+              <w:rPr>
+                <w:sz w:val="24"/>
+                <w:szCs w:val="24"/>
+                <w:lang w:val="en-US"/>
+              </w:rPr>
+            </w:pPr>
+          </w:p>
+        </w:tc>
+        <w:tc>
+          <w:tcPr>
+            <w:tcW w:w="1503" w:type="dxa"/>
+          </w:tcPr>
+          <w:p>
+            <w:pPr>
+              <w:rPr>
+                <w:sz w:val="24"/>
+                <w:szCs w:val="24"/>
+                <w:lang w:val="en-US"/>
+              </w:rPr>
+            </w:pPr>
+          </w:p>
+        </w:tc>
+        <w:tc>
+          <w:tcPr>
+            <w:tcW w:w="1503" w:type="dxa"/>
+          </w:tcPr>
+          <w:p>
+            <w:pPr>
+              <w:rPr>
+                <w:sz w:val="24"/>
+                <w:szCs w:val="24"/>
+                <w:lang w:val="en-US"/>
+              </w:rPr>
+            </w:pPr>
+          </w:p>
+        </w:tc>
+        <w:tc>
+          <w:tcPr>
+            <w:tcW w:w="1503" w:type="dxa"/>
+          </w:tcPr>
+          <w:p>
+            <w:pPr>
+              <w:rPr>
+                <w:sz w:val="24"/>
+                <w:szCs w:val="24"/>
+                <w:lang w:val="en-US"/>
+              </w:rPr>
+            </w:pPr>
+          </w:p>
+        </w:tc>
+        <w:tc>
+          <w:tcPr>
+            <w:tcW w:w="1503" w:type="dxa"/>
+          </w:tcPr>
+          <w:p>
+            <w:pPr>
+              <w:rPr>
+                <w:sz w:val="24"/>
+                <w:szCs w:val="24"/>
+                <w:lang w:val="en-US"/>
+              </w:rPr>
+            </w:pPr>
+          </w:p>
+        </w:tc>
+      </w:tr>
+    </w:tbl>
+    <w:p>
+      <w:pPr>
+        <w:rPr>
+          <w:sz w:val="24"/>
+          <w:szCs w:val="24"/>
+          <w:lang w:val="en-US"/>
+        </w:rPr>
+      </w:pPr>
+    </w:p>
+    <w:p>
+      <w:pPr>
+        <w:rPr>
+          <w:caps/>
+          <w:color w:val="FFFFFF" w:themeColor="background1"/>
+          <w:spacing w:val="15"/>
           <w:sz w:val="24"/>
           <w:szCs w:val="24"/>
           <w:lang w:val="en-US"/>
@@ -3598,6 +4762,25 @@
           <w:szCs w:val="24"/>
           <w:lang w:val="en-US"/>
         </w:rPr>
+        <w:br w:type="page"/>
+      </w:r>
+    </w:p>
+    <w:p>
+      <w:pPr>
+        <w:pStyle w:val="Heading1"/>
+        <w:rPr>
+          <w:sz w:val="24"/>
+          <w:szCs w:val="24"/>
+          <w:lang w:val="en-US"/>
+        </w:rPr>
+      </w:pPr>
+      <w:r>
+        <w:rPr>
+          <w:sz w:val="24"/>
+          <w:szCs w:val="24"/>
+          <w:lang w:val="en-US"/>
+        </w:rPr>
+        <w:lastRenderedPageBreak/>
         <w:t>Reference List</w:t>
       </w:r>
       <w:bookmarkEnd w:id="14"/>
@@ -6001,6 +7184,25 @@
       <w:shd w:val="clear" w:color="auto" w:fill="E1DFDD"/>
     </w:rPr>
   </w:style>
+  <w:style w:type="table" w:styleId="TableGrid">
+    <w:name w:val="Table Grid"/>
+    <w:basedOn w:val="TableNormal"/>
+    <w:uiPriority w:val="39"/>
+    <w:rsid w:val="00792711"/>
+    <w:pPr>
+      <w:spacing w:before="0" w:after="0" w:line="240" w:lineRule="auto"/>
+    </w:pPr>
+    <w:tblPr>
+      <w:tblBorders>
+        <w:top w:val="single" w:sz="4" w:space="0" w:color="auto"/>
+        <w:left w:val="single" w:sz="4" w:space="0" w:color="auto"/>
+        <w:bottom w:val="single" w:sz="4" w:space="0" w:color="auto"/>
+        <w:right w:val="single" w:sz="4" w:space="0" w:color="auto"/>
+        <w:insideH w:val="single" w:sz="4" w:space="0" w:color="auto"/>
+        <w:insideV w:val="single" w:sz="4" w:space="0" w:color="auto"/>
+      </w:tblBorders>
+    </w:tblPr>
+  </w:style>
 </w:styles>
 </file>
 

</xml_diff>